<commit_message>
Polish Paper 1 tables + add KSO oral abstract (KR/EN)
- Table 2: harmonize backbone OR to 2 dp (now consistent with Table 3 for the
  same genes); IGF1R tissue adj P shown as >0.99 instead of 1.00.
- Regenerate submission .docx (surgical cell update, formatting preserved;
  validated via LibreOffice). Update master md5 references (a3662985...).
- Add submission/KSO_oral_abstract_KR_EN.md: Korean Ophthalmological Society
  oral-presentation abstract in Korean and English, numbers matched to master.

https://claude.ai/code/session_01TiAKffYKtUstdRZFkwtJA9
</commit_message>
<xml_diff>
--- a/MANUSCRIPT_TED_TRAP_v5_SUBMISSION.docx
+++ b/MANUSCRIPT_TED_TRAP_v5_SUBMISSION.docx
@@ -4444,7 +4444,7 @@
               <w:jc w:val="left"/>
             </w:pPr>
             <w:r>
-              <w:t xml:space="preserve">0.123 (0.072–0.209)</w:t>
+              <w:t xml:space="preserve">0.12 (0.07–0.21)</w:t>
             </w:r>
           </w:p>
         </w:tc>
@@ -4562,7 +4562,7 @@
               <w:jc w:val="left"/>
             </w:pPr>
             <w:r>
-              <w:t xml:space="preserve">0.087 (0.057–0.135)</w:t>
+              <w:t xml:space="preserve">0.09 (0.06–0.14)</w:t>
             </w:r>
           </w:p>
         </w:tc>
@@ -4676,7 +4676,7 @@
               <w:jc w:val="left"/>
             </w:pPr>
             <w:r>
-              <w:t xml:space="preserve">0.097 (0.040–0.237)</w:t>
+              <w:t xml:space="preserve">0.10 (0.04–0.24)</w:t>
             </w:r>
           </w:p>
         </w:tc>
@@ -4800,7 +4800,7 @@
               <w:jc w:val="left"/>
             </w:pPr>
             <w:r>
-              <w:t xml:space="preserve">1.562 (1.069–2.283)</w:t>
+              <w:t xml:space="preserve">1.56 (1.07–2.28)</w:t>
             </w:r>
           </w:p>
         </w:tc>
@@ -4872,7 +4872,7 @@
               <w:jc w:val="left"/>
             </w:pPr>
             <w:r>
-              <w:t xml:space="preserve">+0.41 (1.00, NS)</w:t>
+              <w:t xml:space="preserve">+0.41 (&gt;0.99, NS)</w:t>
             </w:r>
           </w:p>
         </w:tc>
@@ -4918,7 +4918,7 @@
               <w:jc w:val="left"/>
             </w:pPr>
             <w:r>
-              <w:t xml:space="preserve">1.349 (1.069–1.702)</w:t>
+              <w:t xml:space="preserve">1.35 (1.07–1.70)</w:t>
             </w:r>
           </w:p>
         </w:tc>
@@ -5032,7 +5032,7 @@
               <w:jc w:val="left"/>
             </w:pPr>
             <w:r>
-              <w:t xml:space="preserve">1.408 (0.852–2.326)</w:t>
+              <w:t xml:space="preserve">1.41 (0.85–2.33)</w:t>
             </w:r>
           </w:p>
         </w:tc>
@@ -5156,7 +5156,7 @@
               <w:jc w:val="left"/>
             </w:pPr>
             <w:r>
-              <w:t xml:space="preserve">0.176 (0.114–0.272)</w:t>
+              <w:t xml:space="preserve">0.18 (0.11–0.27)</w:t>
             </w:r>
           </w:p>
         </w:tc>
@@ -5274,7 +5274,7 @@
               <w:jc w:val="left"/>
             </w:pPr>
             <w:r>
-              <w:t xml:space="preserve">0.208 (0.076–0.569)</w:t>
+              <w:t xml:space="preserve">0.21 (0.08–0.57)</w:t>
             </w:r>
           </w:p>
         </w:tc>
@@ -5388,7 +5388,7 @@
               <w:jc w:val="left"/>
             </w:pPr>
             <w:r>
-              <w:t xml:space="preserve">0.171 (0.043–0.676)</w:t>
+              <w:t xml:space="preserve">0.17 (0.04–0.68)</w:t>
             </w:r>
           </w:p>
         </w:tc>

</xml_diff>

<commit_message>
Firewall MR-paper tissue Methods vs the companion RNA-seq paper (anti-salami)
Same n=5 orbital dataset underlies a separate (submitted) transcriptomic paper.
Reword tissue Methods to state explicitly that only the three prespecified
backbone genes are reported and NO genome-wide DE catalogue / pathway result is
presented here. Regenerate submission .docx cleanly from master via pandoc
(title, 2-dp ORs, >0.99, firewall all consistent). Refresh md5 references.

https://claude.ai/code/session_01TiAKffYKtUstdRZFkwtJA9
</commit_message>
<xml_diff>
--- a/MANUSCRIPT_TED_TRAP_v5_SUBMISSION.docx
+++ b/MANUSCRIPT_TED_TRAP_v5_SUBMISSION.docx
@@ -20,7 +20,7 @@
         <w:t xml:space="preserve">TSHR vs IGF-1R in Graves Disease and TED</w:t>
       </w:r>
     </w:p>
-    <w:bookmarkStart w:id="42" w:name="X00eea3dbea3e69a78b56c7207a4be294fd958fd"/>
+    <w:bookmarkStart w:id="42" w:name="X8e4de8cb1853d52dd775242776ae16b70cd596c"/>
     <w:p>
       <w:pPr>
         <w:pStyle w:val="Heading1"/>
@@ -1011,7 +1011,7 @@
         <w:pStyle w:val="FirstParagraph"/>
       </w:pPr>
       <w:r>
-        <w:t xml:space="preserve">Exploratory tissue-level support was assessed using an in-house bulk RNA-seq dataset of orbital tissue from a Korean cohort comprising four TED patients and one control. Technical replicates were collapsed to the biological-sample level by summing raw counts before differential expression analysis with DESeq2 [24]; Benjamini–Hochberg adjusted P values were obtained from the transcriptome-wide DESeq2 analysis, and results for the prespecified backbone genes (</w:t>
+        <w:t xml:space="preserve">Exploratory tissue-level support was assessed using an in-house bulk RNA-seq dataset of orbital tissue from a Korean cohort comprising four TED patients and one control. Technical replicates were collapsed to the biological-sample level by summing raw counts, and gene-level differential expression was estimated with DESeq2 [24] with Benjamini–Hochberg correction computed across genes. This study reports only the three prespecified backbone genes (</w:t>
       </w:r>
       <w:r>
         <w:rPr>
@@ -1047,7 +1047,7 @@
         <w:t xml:space="preserve">CTLA4</w:t>
       </w:r>
       <w:r>
-        <w:t xml:space="preserve">) were extracted for tissue triangulation (Figure 3C; Table 2). This dataset was used only for exploratory tissue-level support, not for genetic instrument selection, and no external transcriptomic dataset was incorporated.</w:t>
+        <w:t xml:space="preserve">) for hypothesis-driven tissue triangulation (Figure 3C; Table 2); no genome-wide transcriptomic catalogue, differential-expression list, or pathway-enrichment result is presented here. The dataset was used solely for exploratory tissue-level support of the genetically prioritized backbone genes, not for genetic instrument selection, and no external transcriptomic dataset was incorporated.</w:t>
       </w:r>
     </w:p>
     <w:bookmarkEnd w:id="27"/>

</xml_diff>

<commit_message>
Add informed-consent declaration; finalize submission package
- Declarations: add 'Informed consent' (written consent obtained from orbital
  tissue participants).
- Regenerate submission .docx from master (consent, Version 1 title, 2-dp ORs,
  >0.99, tissue Methods firewall all consistent; 11 tables; LibreOffice-validated).
- Refresh master md5 references (378dafb9).

https://claude.ai/code/session_01TiAKffYKtUstdRZFkwtJA9
</commit_message>
<xml_diff>
--- a/MANUSCRIPT_TED_TRAP_v5_SUBMISSION.docx
+++ b/MANUSCRIPT_TED_TRAP_v5_SUBMISSION.docx
@@ -2830,6 +2830,24 @@
       </w:r>
       <w:r>
         <w:t xml:space="preserve">This study used publicly available, de-identified summary statistics and an institutionally approved orbital tissue dataset. The in-house orbital transcriptomic component was approved by the Institutional Review Board of Pusan National University Hospital (approval number 2104-018-102) and was conducted in accordance with the Declaration of Helsinki.</w:t>
+      </w:r>
+    </w:p>
+    <w:p>
+      <w:pPr>
+        <w:pStyle w:val="BodyText"/>
+      </w:pPr>
+      <w:r>
+        <w:rPr>
+          <w:bCs/>
+          <w:b/>
+        </w:rPr>
+        <w:t xml:space="preserve">Informed consent.</w:t>
+      </w:r>
+      <w:r>
+        <w:t xml:space="preserve"> </w:t>
+      </w:r>
+      <w:r>
+        <w:t xml:space="preserve">Written informed consent was obtained from all individual participants included in the in-house orbital tissue study.</w:t>
       </w:r>
     </w:p>
     <w:p>

</xml_diff>

<commit_message>
Change author: Yae-Eun Kang -> Min-Seon Kim (same affiliation)
Update byline and author-contributions initials (Y.-E.K. -> M.-S.K.) in master,
the KSO Korean abstract, and regenerate the submission .docx; refresh md5 refs.

https://claude.ai/code/session_01TiAKffYKtUstdRZFkwtJA9
</commit_message>
<xml_diff>
--- a/MANUSCRIPT_TED_TRAP_v5_SUBMISSION.docx
+++ b/MANUSCRIPT_TED_TRAP_v5_SUBMISSION.docx
@@ -34,7 +34,7 @@
         <w:pStyle w:val="FirstParagraph"/>
       </w:pPr>
       <w:r>
-        <w:t xml:space="preserve">Jungyul Park¹, Yae-Eun Kang², Kyung-Hwa Shin³⁎, Suk-Woo Yang¹⁎</w:t>
+        <w:t xml:space="preserve">Jungyul Park¹, Min-Seon Kim², Kyung-Hwa Shin³⁎, Suk-Woo Yang¹⁎</w:t>
       </w:r>
     </w:p>
     <w:p>
@@ -2896,7 +2896,7 @@
         <w:t xml:space="preserve"> </w:t>
       </w:r>
       <w:r>
-        <w:t xml:space="preserve">J.P. conceived and designed the study, performed the analyses, and drafted the manuscript. Y.-E.K. contributed to data collection and interpretation. K.-H.S. and S.-W.Y. supervised the study and revised the manuscript. All authors read and approved the final manuscript.</w:t>
+        <w:t xml:space="preserve">J.P. conceived and designed the study, performed the analyses, and drafted the manuscript. M.-S.K. contributed to data collection and interpretation. K.-H.S. and S.-W.Y. supervised the study and revised the manuscript. All authors read and approved the final manuscript.</w:t>
       </w:r>
     </w:p>
     <w:p>

</xml_diff>